<commit_message>
fix(paper): rebuild DOCX from inside paper/ directory to embed images
</commit_message>
<xml_diff>
--- a/paper/insight_paper_v1.docx
+++ b/paper/insight_paper_v1.docx
@@ -149,31 +149,53 @@
         <w:t xml:space="preserve">experienced severe drought while maize was actively growing. The remaining 23 counties had already harvested. This distinction is critical for targeting agricultural relief: drought severity and crop damage are entirely different metrics.</w:t>
       </w:r>
     </w:p>
-    <w:tbl>
-      <w:tblPr>
-        <w:tblStyle w:val="FigureTable"/>
-        <w:tblW w:type="auto" w:w="0"/>
-        <w:jc w:val="center"/>
-        <w:tblLook w:firstRow="0" w:lastRow="0" w:firstColumn="0" w:lastColumn="0"/>
-      </w:tblPr>
-      <w:tblGrid>
-        <w:gridCol w:w="7920"/>
-      </w:tblGrid>
-      <w:tr>
-        <w:tc>
-          <w:tcPr/>
-          <w:p>
-            <w:pPr>
-              <w:pStyle w:val="Compact"/>
-              <w:jc w:val="center"/>
-            </w:pPr>
-            <w:r>
-              <w:t xml:space="preserve">31 vs 8 severe counties</w:t>
-            </w:r>
-          </w:p>
-        </w:tc>
-      </w:tr>
-    </w:tbl>
+    <w:p>
+      <w:pPr>
+        <w:pStyle w:val="CaptionedFigure"/>
+      </w:pPr>
+      <w:r>
+        <w:drawing>
+          <wp:inline>
+            <wp:extent cx="5334000" cy="3215518"/>
+            <wp:effectExtent b="0" l="0" r="0" t="0"/>
+            <wp:docPr descr="31 vs 8 severe counties" title="" id="14" name="Picture"/>
+            <a:graphic>
+              <a:graphicData uri="http://schemas.openxmlformats.org/drawingml/2006/picture">
+                <pic:pic>
+                  <pic:nvPicPr>
+                    <pic:cNvPr descr="figures/fig_31_vs_8_map.png" id="15" name="Picture"/>
+                    <pic:cNvPicPr>
+                      <a:picLocks noChangeArrowheads="1" noChangeAspect="1"/>
+                    </pic:cNvPicPr>
+                  </pic:nvPicPr>
+                  <pic:blipFill>
+                    <a:blip r:embed="rId13"/>
+                    <a:stretch>
+                      <a:fillRect/>
+                    </a:stretch>
+                  </pic:blipFill>
+                  <pic:spPr bwMode="auto">
+                    <a:xfrm>
+                      <a:off x="0" y="0"/>
+                      <a:ext cx="5334000" cy="3215518"/>
+                    </a:xfrm>
+                    <a:prstGeom prst="rect">
+                      <a:avLst/>
+                    </a:prstGeom>
+                    <a:noFill/>
+                    <a:ln w="9525">
+                      <a:noFill/>
+                      <a:headEnd/>
+                      <a:tailEnd/>
+                    </a:ln>
+                  </pic:spPr>
+                </pic:pic>
+              </a:graphicData>
+            </a:graphic>
+          </wp:inline>
+        </w:drawing>
+      </w:r>
+    </w:p>
     <w:p>
       <w:pPr>
         <w:pStyle w:val="ImageCaption"/>
@@ -200,31 +222,53 @@
         <w:t xml:space="preserve">Analysis of 4,252 county-months revealed that topsoil moisture anomalies precede vegetation anomalies by approximately one month (r = 0.461, 95% CI [0.436, 0.485]). By monitoring soil moisture, decision-makers can anticipate vegetation collapse and crop failure four weeks before it appears in satellite imagery.</w:t>
       </w:r>
     </w:p>
-    <w:tbl>
-      <w:tblPr>
-        <w:tblStyle w:val="FigureTable"/>
-        <w:tblW w:type="auto" w:w="0"/>
-        <w:jc w:val="center"/>
-        <w:tblLook w:firstRow="0" w:lastRow="0" w:firstColumn="0" w:lastColumn="0"/>
-      </w:tblPr>
-      <w:tblGrid>
-        <w:gridCol w:w="7920"/>
-      </w:tblGrid>
-      <w:tr>
-        <w:tc>
-          <w:tcPr/>
-          <w:p>
-            <w:pPr>
-              <w:pStyle w:val="Compact"/>
-              <w:jc w:val="center"/>
-            </w:pPr>
-            <w:r>
-              <w:t xml:space="preserve">Soil moisture lead</w:t>
-            </w:r>
-          </w:p>
-        </w:tc>
-      </w:tr>
-    </w:tbl>
+    <w:p>
+      <w:pPr>
+        <w:pStyle w:val="CaptionedFigure"/>
+      </w:pPr>
+      <w:r>
+        <w:drawing>
+          <wp:inline>
+            <wp:extent cx="5334000" cy="2906760"/>
+            <wp:effectExtent b="0" l="0" r="0" t="0"/>
+            <wp:docPr descr="Soil moisture lead" title="" id="17" name="Picture"/>
+            <a:graphic>
+              <a:graphicData uri="http://schemas.openxmlformats.org/drawingml/2006/picture">
+                <pic:pic>
+                  <pic:nvPicPr>
+                    <pic:cNvPr descr="figures/fig_soil_moisture_lead.png" id="18" name="Picture"/>
+                    <pic:cNvPicPr>
+                      <a:picLocks noChangeArrowheads="1" noChangeAspect="1"/>
+                    </pic:cNvPicPr>
+                  </pic:nvPicPr>
+                  <pic:blipFill>
+                    <a:blip r:embed="rId16"/>
+                    <a:stretch>
+                      <a:fillRect/>
+                    </a:stretch>
+                  </pic:blipFill>
+                  <pic:spPr bwMode="auto">
+                    <a:xfrm>
+                      <a:off x="0" y="0"/>
+                      <a:ext cx="5334000" cy="2906760"/>
+                    </a:xfrm>
+                    <a:prstGeom prst="rect">
+                      <a:avLst/>
+                    </a:prstGeom>
+                    <a:noFill/>
+                    <a:ln w="9525">
+                      <a:noFill/>
+                      <a:headEnd/>
+                      <a:tailEnd/>
+                    </a:ln>
+                  </pic:spPr>
+                </pic:pic>
+              </a:graphicData>
+            </a:graphic>
+          </wp:inline>
+        </w:drawing>
+      </w:r>
+    </w:p>
     <w:p>
       <w:pPr>
         <w:pStyle w:val="ImageCaption"/>
@@ -281,11 +325,11 @@
       <w:pPr>
         <w:pStyle w:val="Heading2"/>
       </w:pPr>
-      <w:bookmarkStart w:id="13" w:name="_recommendations"/>
+      <w:bookmarkStart w:id="19" w:name="_recommendations"/>
       <w:r>
         <w:t xml:space="preserve">Recommendations</w:t>
       </w:r>
-      <w:bookmarkEnd w:id="13"/>
+      <w:bookmarkEnd w:id="19"/>
     </w:p>
     <w:p>
       <w:pPr>
@@ -357,11 +401,11 @@
       <w:pPr>
         <w:pStyle w:val="Heading2"/>
       </w:pPr>
-      <w:bookmarkStart w:id="14" w:name="_limitations"/>
+      <w:bookmarkStart w:id="20" w:name="_limitations"/>
       <w:r>
         <w:t xml:space="preserve">Limitations</w:t>
       </w:r>
-      <w:bookmarkEnd w:id="14"/>
+      <w:bookmarkEnd w:id="20"/>
     </w:p>
     <w:p>
       <w:pPr>

</xml_diff>